<commit_message>
Fix self-service templates: clean headers/footers, fix corrupted will
- dpoa_selfservice.docx: cleared all headers/footers referencing Health Care
  Directive, Last Will, or Trust — only keeps correct DPOA footer
- hcd_selfservice.docx: cleared footers referencing DPOA, Will, or Trust —
  keeps correct Health Care Directive headers
- will_selfservice.docx: regenerated from create_will.js (previous copy was
  corrupted/not a valid ZIP)

Co-Authored-By: Claude Opus 4.6 <noreply@anthropic.com>
</commit_message>
<xml_diff>
--- a/templates/dpoa_selfservice.docx
+++ b/templates/dpoa_selfservice.docx
@@ -1491,7 +1491,7 @@
             <w:rFonts w:ascii="Times New Roman" w:hAnsi="Times New Roman" w:cs="Times New Roman"/>
             <w:i/>
           </w:rPr>
-          <w:t xml:space="preserve">Last Will of </w:t>
+          <w:t xml:space="preserve"/>
         </w:r>
         <w:r>
           <w:rPr>
@@ -1520,7 +1520,7 @@
             <w:i/>
             <w:noProof/>
           </w:rPr>
-          <w:t>«Your_Preferred_Signature_Name»</w:t>
+          <w:t/>
         </w:r>
         <w:r>
           <w:rPr>
@@ -1544,7 +1544,7 @@
             <w:rFonts w:ascii="Times New Roman" w:hAnsi="Times New Roman" w:cs="Times New Roman"/>
             <w:i/>
           </w:rPr>
-          <w:t xml:space="preserve">Page </w:t>
+          <w:t xml:space="preserve"/>
         </w:r>
         <w:r>
           <w:rPr>
@@ -1573,7 +1573,7 @@
             <w:i/>
             <w:noProof/>
           </w:rPr>
-          <w:t>5</w:t>
+          <w:t/>
         </w:r>
         <w:r>
           <w:rPr>
@@ -1589,7 +1589,7 @@
             <w:i/>
             <w:noProof/>
           </w:rPr>
-          <w:t xml:space="preserve"> of </w:t>
+          <w:t xml:space="preserve"/>
         </w:r>
         <w:r>
           <w:rPr>
@@ -1597,7 +1597,7 @@
             <w:i/>
             <w:noProof/>
           </w:rPr>
-          <w:t>6</w:t>
+          <w:t/>
         </w:r>
       </w:p>
     </w:sdtContent>
@@ -1854,7 +1854,7 @@
         <w:sz w:val="20"/>
         <w:szCs w:val="20"/>
       </w:rPr>
-      <w:t>«NAME_OF_TRUST»</w:t>
+      <w:t/>
     </w:r>
     <w:r>
       <w:rPr>
@@ -1914,7 +1914,7 @@
         <w:sz w:val="18"/>
         <w:szCs w:val="18"/>
       </w:rPr>
-      <w:t>Utah Advance Health Care Directive</w:t>
+      <w:t/>
     </w:r>
     <w:r>
       <w:rPr>
@@ -1922,7 +1922,7 @@
         <w:szCs w:val="18"/>
       </w:rPr>
       <w:tab/>
-      <w:t xml:space="preserve">Page </w:t>
+      <w:t xml:space="preserve"/>
     </w:r>
     <w:r>
       <w:rPr>
@@ -1951,7 +1951,7 @@
         <w:sz w:val="18"/>
         <w:szCs w:val="18"/>
       </w:rPr>
-      <w:t>1</w:t>
+      <w:t/>
     </w:r>
     <w:r>
       <w:rPr>
@@ -1966,7 +1966,7 @@
         <w:sz w:val="18"/>
         <w:szCs w:val="18"/>
       </w:rPr>
-      <w:t xml:space="preserve"> of 4</w:t>
+      <w:t xml:space="preserve"/>
     </w:r>
   </w:p>
   <w:p>
@@ -1993,7 +1993,7 @@
         <w:i/>
         <w:iCs/>
       </w:rPr>
-      <w:t xml:space="preserve">Utah </w:t>
+      <w:t xml:space="preserve"/>
     </w:r>
     <w:r>
       <w:rPr>
@@ -2001,7 +2001,7 @@
         <w:i/>
         <w:iCs/>
       </w:rPr>
-      <w:t>Health Care Directive</w:t>
+      <w:t/>
     </w:r>
     <w:r>
       <w:rPr>
@@ -2009,7 +2009,7 @@
         <w:i/>
         <w:iCs/>
       </w:rPr>
-      <w:t xml:space="preserve"> (</w:t>
+      <w:t xml:space="preserve"/>
     </w:r>
     <w:r>
       <w:rPr>
@@ -2042,7 +2042,7 @@
         <w:iCs/>
         <w:noProof/>
       </w:rPr>
-      <w:t>«Your_First_Name»</w:t>
+      <w:t/>
     </w:r>
     <w:r>
       <w:rPr>
@@ -2058,7 +2058,7 @@
         <w:i/>
         <w:iCs/>
       </w:rPr>
-      <w:t>)</w:t>
+      <w:t/>
     </w:r>
   </w:p>
 </w:hdr>
@@ -2084,7 +2084,7 @@
         <w:i/>
         <w:iCs/>
       </w:rPr>
-      <w:t xml:space="preserve">Utah </w:t>
+      <w:t xml:space="preserve"/>
     </w:r>
     <w:r>
       <w:rPr>
@@ -2092,7 +2092,7 @@
         <w:i/>
         <w:iCs/>
       </w:rPr>
-      <w:t>Health Care Directive</w:t>
+      <w:t/>
     </w:r>
     <w:r>
       <w:rPr>
@@ -2100,7 +2100,7 @@
         <w:i/>
         <w:iCs/>
       </w:rPr>
-      <w:t xml:space="preserve"> (</w:t>
+      <w:t xml:space="preserve"/>
     </w:r>
     <w:r>
       <w:rPr>
@@ -2133,7 +2133,7 @@
         <w:iCs/>
         <w:noProof/>
       </w:rPr>
-      <w:t>«Your_First_Name»</w:t>
+      <w:t/>
     </w:r>
     <w:r>
       <w:rPr>
@@ -2149,7 +2149,7 @@
         <w:i/>
         <w:iCs/>
       </w:rPr>
-      <w:t>)</w:t>
+      <w:t/>
     </w:r>
     <w:r>
       <w:rPr>
@@ -2158,7 +2158,7 @@
         <w:iCs/>
       </w:rPr>
       <w:tab/>
-      <w:t xml:space="preserve">Page </w:t>
+      <w:t xml:space="preserve"/>
     </w:r>
     <w:r>
       <w:rPr>
@@ -2191,7 +2191,7 @@
         <w:iCs/>
         <w:noProof/>
       </w:rPr>
-      <w:t>1</w:t>
+      <w:t/>
     </w:r>
     <w:r>
       <w:rPr>
@@ -2209,7 +2209,7 @@
         <w:iCs/>
         <w:noProof/>
       </w:rPr>
-      <w:t xml:space="preserve"> of 4</w:t>
+      <w:t xml:space="preserve"/>
     </w:r>
   </w:p>
 </w:hdr>

</xml_diff>